<commit_message>
Update homework .docx with complete documentation and screenshots
Made-with: Cursor
</commit_message>
<xml_diff>
--- a/08_function_calling/Homework2_Anjali_Katta.docx
+++ b/08_function_calling/Homework2_Anjali_Katta.docx
@@ -108,7 +108,6 @@
         <w:rPr>
           <w:b/>
         </w:rPr>
-        <w:lastRenderedPageBreak/>
         <w:t>RAG implementation (Lab 2)</w:t>
       </w:r>
       <w:r>
@@ -220,42 +219,6 @@
         <w:rPr>
           <w:noProof/>
         </w:rPr>
-        <w:lastRenderedPageBreak/>
-        <w:drawing>
-          <wp:inline distT="0" distB="0" distL="0" distR="0" wp14:anchorId="5D350A39" wp14:editId="64FB4609">
-            <wp:extent cx="5486400" cy="8072120"/>
-            <wp:effectExtent l="0" t="0" r="0" b="5080"/>
-            <wp:docPr id="1039606957" name="Picture 2" descr="A screenshot of a computer&#10;&#10;AI-generated content may be incorrect."/>
-            <wp:cNvGraphicFramePr>
-              <a:graphicFrameLocks xmlns:a="http://schemas.openxmlformats.org/drawingml/2006/main" noChangeAspect="1"/>
-            </wp:cNvGraphicFramePr>
-            <a:graphic xmlns:a="http://schemas.openxmlformats.org/drawingml/2006/main">
-              <a:graphicData uri="http://schemas.openxmlformats.org/drawingml/2006/picture">
-                <pic:pic xmlns:pic="http://schemas.openxmlformats.org/drawingml/2006/picture">
-                  <pic:nvPicPr>
-                    <pic:cNvPr id="1039606957" name="Picture 2" descr="A screenshot of a computer&#10;&#10;AI-generated content may be incorrect."/>
-                    <pic:cNvPicPr/>
-                  </pic:nvPicPr>
-                  <pic:blipFill>
-                    <a:blip r:embed="rId6"/>
-                    <a:stretch>
-                      <a:fillRect/>
-                    </a:stretch>
-                  </pic:blipFill>
-                  <pic:spPr>
-                    <a:xfrm>
-                      <a:off x="0" y="0"/>
-                      <a:ext cx="5486400" cy="8072120"/>
-                    </a:xfrm>
-                    <a:prstGeom prst="rect">
-                      <a:avLst/>
-                    </a:prstGeom>
-                  </pic:spPr>
-                </pic:pic>
-              </a:graphicData>
-            </a:graphic>
-          </wp:inline>
-        </w:drawing>
       </w:r>
     </w:p>
     <w:p>
@@ -266,7 +229,6 @@
         <w:rPr>
           <w:color w:val="1E40AF"/>
         </w:rPr>
-        <w:lastRenderedPageBreak/>
         <w:t>3.2 RAG Retrieval and Response (lab_custom_rag_query.py)</w:t>
       </w:r>
     </w:p>
@@ -283,41 +245,6 @@
         <w:rPr>
           <w:noProof/>
         </w:rPr>
-        <w:drawing>
-          <wp:inline distT="0" distB="0" distL="0" distR="0" wp14:anchorId="4EA58891" wp14:editId="0D6035F6">
-            <wp:extent cx="5486400" cy="5479415"/>
-            <wp:effectExtent l="0" t="0" r="0" b="0"/>
-            <wp:docPr id="2045342088" name="Picture 3" descr="A screenshot of a computer&#10;&#10;AI-generated content may be incorrect."/>
-            <wp:cNvGraphicFramePr>
-              <a:graphicFrameLocks xmlns:a="http://schemas.openxmlformats.org/drawingml/2006/main" noChangeAspect="1"/>
-            </wp:cNvGraphicFramePr>
-            <a:graphic xmlns:a="http://schemas.openxmlformats.org/drawingml/2006/main">
-              <a:graphicData uri="http://schemas.openxmlformats.org/drawingml/2006/picture">
-                <pic:pic xmlns:pic="http://schemas.openxmlformats.org/drawingml/2006/picture">
-                  <pic:nvPicPr>
-                    <pic:cNvPr id="2045342088" name="Picture 3" descr="A screenshot of a computer&#10;&#10;AI-generated content may be incorrect."/>
-                    <pic:cNvPicPr/>
-                  </pic:nvPicPr>
-                  <pic:blipFill>
-                    <a:blip r:embed="rId7"/>
-                    <a:stretch>
-                      <a:fillRect/>
-                    </a:stretch>
-                  </pic:blipFill>
-                  <pic:spPr>
-                    <a:xfrm>
-                      <a:off x="0" y="0"/>
-                      <a:ext cx="5486400" cy="5479415"/>
-                    </a:xfrm>
-                    <a:prstGeom prst="rect">
-                      <a:avLst/>
-                    </a:prstGeom>
-                  </pic:spPr>
-                </pic:pic>
-              </a:graphicData>
-            </a:graphic>
-          </wp:inline>
-        </w:drawing>
       </w:r>
     </w:p>
     <w:p>
@@ -344,42 +271,6 @@
         <w:rPr>
           <w:noProof/>
         </w:rPr>
-        <w:lastRenderedPageBreak/>
-        <w:drawing>
-          <wp:inline distT="0" distB="0" distL="0" distR="0" wp14:anchorId="71786E42" wp14:editId="2D4534EF">
-            <wp:extent cx="5486400" cy="4955540"/>
-            <wp:effectExtent l="0" t="0" r="0" b="0"/>
-            <wp:docPr id="492887910" name="Picture 4" descr="A screenshot of a computer&#10;&#10;AI-generated content may be incorrect."/>
-            <wp:cNvGraphicFramePr>
-              <a:graphicFrameLocks xmlns:a="http://schemas.openxmlformats.org/drawingml/2006/main" noChangeAspect="1"/>
-            </wp:cNvGraphicFramePr>
-            <a:graphic xmlns:a="http://schemas.openxmlformats.org/drawingml/2006/main">
-              <a:graphicData uri="http://schemas.openxmlformats.org/drawingml/2006/picture">
-                <pic:pic xmlns:pic="http://schemas.openxmlformats.org/drawingml/2006/picture">
-                  <pic:nvPicPr>
-                    <pic:cNvPr id="492887910" name="Picture 4" descr="A screenshot of a computer&#10;&#10;AI-generated content may be incorrect."/>
-                    <pic:cNvPicPr/>
-                  </pic:nvPicPr>
-                  <pic:blipFill>
-                    <a:blip r:embed="rId8"/>
-                    <a:stretch>
-                      <a:fillRect/>
-                    </a:stretch>
-                  </pic:blipFill>
-                  <pic:spPr>
-                    <a:xfrm>
-                      <a:off x="0" y="0"/>
-                      <a:ext cx="5486400" cy="4955540"/>
-                    </a:xfrm>
-                    <a:prstGeom prst="rect">
-                      <a:avLst/>
-                    </a:prstGeom>
-                  </pic:spPr>
-                </pic:pic>
-              </a:graphicData>
-            </a:graphic>
-          </wp:inline>
-        </w:drawing>
       </w:r>
     </w:p>
     <w:p>
@@ -387,42 +278,6 @@
         <w:rPr>
           <w:noProof/>
         </w:rPr>
-        <w:lastRenderedPageBreak/>
-        <w:drawing>
-          <wp:inline distT="0" distB="0" distL="0" distR="0" wp14:anchorId="4EAEC6CC" wp14:editId="3271B039">
-            <wp:extent cx="5486400" cy="4475480"/>
-            <wp:effectExtent l="0" t="0" r="0" b="0"/>
-            <wp:docPr id="1210307021" name="Picture 5" descr="A screenshot of a computer&#10;&#10;AI-generated content may be incorrect."/>
-            <wp:cNvGraphicFramePr>
-              <a:graphicFrameLocks xmlns:a="http://schemas.openxmlformats.org/drawingml/2006/main" noChangeAspect="1"/>
-            </wp:cNvGraphicFramePr>
-            <a:graphic xmlns:a="http://schemas.openxmlformats.org/drawingml/2006/main">
-              <a:graphicData uri="http://schemas.openxmlformats.org/drawingml/2006/picture">
-                <pic:pic xmlns:pic="http://schemas.openxmlformats.org/drawingml/2006/picture">
-                  <pic:nvPicPr>
-                    <pic:cNvPr id="1210307021" name="Picture 5" descr="A screenshot of a computer&#10;&#10;AI-generated content may be incorrect."/>
-                    <pic:cNvPicPr/>
-                  </pic:nvPicPr>
-                  <pic:blipFill>
-                    <a:blip r:embed="rId9"/>
-                    <a:stretch>
-                      <a:fillRect/>
-                    </a:stretch>
-                  </pic:blipFill>
-                  <pic:spPr>
-                    <a:xfrm>
-                      <a:off x="0" y="0"/>
-                      <a:ext cx="5486400" cy="4475480"/>
-                    </a:xfrm>
-                    <a:prstGeom prst="rect">
-                      <a:avLst/>
-                    </a:prstGeom>
-                  </pic:spPr>
-                </pic:pic>
-              </a:graphicData>
-            </a:graphic>
-          </wp:inline>
-        </w:drawing>
       </w:r>
     </w:p>
     <w:p>
@@ -450,42 +305,6 @@
         <w:rPr>
           <w:noProof/>
         </w:rPr>
-        <w:lastRenderedPageBreak/>
-        <w:drawing>
-          <wp:inline distT="0" distB="0" distL="0" distR="0" wp14:anchorId="44CEEA5A" wp14:editId="7AF8D019">
-            <wp:extent cx="5486400" cy="4204335"/>
-            <wp:effectExtent l="0" t="0" r="0" b="0"/>
-            <wp:docPr id="743391783" name="Picture 6" descr="A screenshot of a computer&#10;&#10;AI-generated content may be incorrect."/>
-            <wp:cNvGraphicFramePr>
-              <a:graphicFrameLocks xmlns:a="http://schemas.openxmlformats.org/drawingml/2006/main" noChangeAspect="1"/>
-            </wp:cNvGraphicFramePr>
-            <a:graphic xmlns:a="http://schemas.openxmlformats.org/drawingml/2006/main">
-              <a:graphicData uri="http://schemas.openxmlformats.org/drawingml/2006/picture">
-                <pic:pic xmlns:pic="http://schemas.openxmlformats.org/drawingml/2006/picture">
-                  <pic:nvPicPr>
-                    <pic:cNvPr id="743391783" name="Picture 6" descr="A screenshot of a computer&#10;&#10;AI-generated content may be incorrect."/>
-                    <pic:cNvPicPr/>
-                  </pic:nvPicPr>
-                  <pic:blipFill>
-                    <a:blip r:embed="rId10"/>
-                    <a:stretch>
-                      <a:fillRect/>
-                    </a:stretch>
-                  </pic:blipFill>
-                  <pic:spPr>
-                    <a:xfrm>
-                      <a:off x="0" y="0"/>
-                      <a:ext cx="5486400" cy="4204335"/>
-                    </a:xfrm>
-                    <a:prstGeom prst="rect">
-                      <a:avLst/>
-                    </a:prstGeom>
-                  </pic:spPr>
-                </pic:pic>
-              </a:graphicData>
-            </a:graphic>
-          </wp:inline>
-        </w:drawing>
       </w:r>
     </w:p>
     <w:p/>
@@ -494,42 +313,6 @@
         <w:rPr>
           <w:noProof/>
         </w:rPr>
-        <w:lastRenderedPageBreak/>
-        <w:drawing>
-          <wp:inline distT="0" distB="0" distL="0" distR="0" wp14:anchorId="3E60C715" wp14:editId="1C46E085">
-            <wp:extent cx="5486400" cy="5521960"/>
-            <wp:effectExtent l="0" t="0" r="0" b="2540"/>
-            <wp:docPr id="1021676434" name="Picture 7" descr="A screenshot of a computer&#10;&#10;AI-generated content may be incorrect."/>
-            <wp:cNvGraphicFramePr>
-              <a:graphicFrameLocks xmlns:a="http://schemas.openxmlformats.org/drawingml/2006/main" noChangeAspect="1"/>
-            </wp:cNvGraphicFramePr>
-            <a:graphic xmlns:a="http://schemas.openxmlformats.org/drawingml/2006/main">
-              <a:graphicData uri="http://schemas.openxmlformats.org/drawingml/2006/picture">
-                <pic:pic xmlns:pic="http://schemas.openxmlformats.org/drawingml/2006/picture">
-                  <pic:nvPicPr>
-                    <pic:cNvPr id="1021676434" name="Picture 7" descr="A screenshot of a computer&#10;&#10;AI-generated content may be incorrect."/>
-                    <pic:cNvPicPr/>
-                  </pic:nvPicPr>
-                  <pic:blipFill>
-                    <a:blip r:embed="rId11"/>
-                    <a:stretch>
-                      <a:fillRect/>
-                    </a:stretch>
-                  </pic:blipFill>
-                  <pic:spPr>
-                    <a:xfrm>
-                      <a:off x="0" y="0"/>
-                      <a:ext cx="5486400" cy="5521960"/>
-                    </a:xfrm>
-                    <a:prstGeom prst="rect">
-                      <a:avLst/>
-                    </a:prstGeom>
-                  </pic:spPr>
-                </pic:pic>
-              </a:graphicData>
-            </a:graphic>
-          </wp:inline>
-        </w:drawing>
       </w:r>
     </w:p>
     <w:p>
@@ -537,42 +320,6 @@
         <w:rPr>
           <w:noProof/>
         </w:rPr>
-        <w:lastRenderedPageBreak/>
-        <w:drawing>
-          <wp:inline distT="0" distB="0" distL="0" distR="0" wp14:anchorId="0D24EBC6" wp14:editId="26606DCD">
-            <wp:extent cx="5486400" cy="4543425"/>
-            <wp:effectExtent l="0" t="0" r="0" b="3175"/>
-            <wp:docPr id="1919686628" name="Picture 8" descr="A screenshot of a computer error&#10;&#10;AI-generated content may be incorrect."/>
-            <wp:cNvGraphicFramePr>
-              <a:graphicFrameLocks xmlns:a="http://schemas.openxmlformats.org/drawingml/2006/main" noChangeAspect="1"/>
-            </wp:cNvGraphicFramePr>
-            <a:graphic xmlns:a="http://schemas.openxmlformats.org/drawingml/2006/main">
-              <a:graphicData uri="http://schemas.openxmlformats.org/drawingml/2006/picture">
-                <pic:pic xmlns:pic="http://schemas.openxmlformats.org/drawingml/2006/picture">
-                  <pic:nvPicPr>
-                    <pic:cNvPr id="1919686628" name="Picture 8" descr="A screenshot of a computer error&#10;&#10;AI-generated content may be incorrect."/>
-                    <pic:cNvPicPr/>
-                  </pic:nvPicPr>
-                  <pic:blipFill>
-                    <a:blip r:embed="rId12"/>
-                    <a:stretch>
-                      <a:fillRect/>
-                    </a:stretch>
-                  </pic:blipFill>
-                  <pic:spPr>
-                    <a:xfrm>
-                      <a:off x="0" y="0"/>
-                      <a:ext cx="5486400" cy="4543425"/>
-                    </a:xfrm>
-                    <a:prstGeom prst="rect">
-                      <a:avLst/>
-                    </a:prstGeom>
-                  </pic:spPr>
-                </pic:pic>
-              </a:graphicData>
-            </a:graphic>
-          </wp:inline>
-        </w:drawing>
       </w:r>
     </w:p>
     <w:p>
@@ -896,7 +643,6 @@
     <w:p/>
     <w:p>
       <w:r>
-        <w:lastRenderedPageBreak/>
         <w:t>Workflow: Agent 1 output and Agent 2 output are both passed to Agent 3, which synthesizes them into a final executive report.</w:t>
       </w:r>
     </w:p>
@@ -1735,7 +1481,6 @@
         <w:rPr>
           <w:color w:val="1E40AF"/>
         </w:rPr>
-        <w:lastRenderedPageBreak/>
         <w:t>4.5 Usage Instructions</w:t>
       </w:r>
     </w:p>

</xml_diff>